<commit_message>
added some fixes to lab
</commit_message>
<xml_diff>
--- a/docs/Федоров Поленов лаб1.docx
+++ b/docs/Федоров Поленов лаб1.docx
@@ -241,34 +241,18 @@
           <w:sz w:val="32"/>
           <w:szCs w:val="36"/>
         </w:rPr>
-        <w:t>по дисциплине «</w:t>
-      </w:r>
-      <w:r>
+        <w:t>по дисциплине «Бизнес логика программных систем»</w:t>
+      </w:r>
+    </w:p>
+    <w:p>
+      <w:pPr>
+        <w:spacing w:before="240" w:after="240"/>
+        <w:jc w:val="center"/>
         <w:rPr>
           <w:rFonts w:eastAsia="Times New Roman" w:cs="Times New Roman"/>
           <w:sz w:val="32"/>
           <w:szCs w:val="36"/>
         </w:rPr>
-        <w:t>Бизнес логика программных систем</w:t>
-      </w:r>
-      <w:r>
-        <w:rPr>
-          <w:rFonts w:eastAsia="Times New Roman" w:cs="Times New Roman"/>
-          <w:sz w:val="32"/>
-          <w:szCs w:val="36"/>
-        </w:rPr>
-        <w:t>»</w:t>
-      </w:r>
-    </w:p>
-    <w:p>
-      <w:pPr>
-        <w:spacing w:before="240" w:after="240"/>
-        <w:jc w:val="center"/>
-        <w:rPr>
-          <w:rFonts w:eastAsia="Times New Roman" w:cs="Times New Roman"/>
-          <w:sz w:val="32"/>
-          <w:szCs w:val="36"/>
-        </w:rPr>
       </w:pPr>
     </w:p>
     <w:p>
@@ -279,7 +263,6 @@
           <w:rFonts w:eastAsia="Times New Roman" w:cs="Times New Roman"/>
           <w:sz w:val="36"/>
           <w:szCs w:val="36"/>
-          <w:lang w:val="en-US"/>
         </w:rPr>
       </w:pPr>
       <w:r>
@@ -296,7 +279,6 @@
           <w:b/>
           <w:sz w:val="36"/>
           <w:szCs w:val="36"/>
-          <w:lang w:val="en-US"/>
         </w:rPr>
         <w:t>2412</w:t>
       </w:r>
@@ -498,7 +480,12 @@
     <w:sdt>
       <w:sdtPr>
         <w:rPr>
-          <w:lang w:val="ru-RU"/>
+          <w:rFonts w:eastAsiaTheme="minorHAnsi" w:cstheme="minorBidi"/>
+          <w:bCs w:val="0"/>
+          <w:color w:val="auto"/>
+          <w:sz w:val="24"/>
+          <w:szCs w:val="22"/>
+          <w:lang w:val="ru-RU" w:eastAsia="en-US"/>
         </w:rPr>
         <w:id w:val="101236254"/>
         <w:docPartObj>
@@ -508,13 +495,8 @@
       </w:sdtPr>
       <w:sdtEndPr>
         <w:rPr>
-          <w:rFonts w:eastAsiaTheme="minorHAnsi" w:cstheme="minorBidi"/>
           <w:b/>
           <w:noProof/>
-          <w:color w:val="auto"/>
-          <w:sz w:val="24"/>
-          <w:szCs w:val="22"/>
-          <w:lang w:eastAsia="en-US"/>
         </w:rPr>
       </w:sdtEndPr>
       <w:sdtContent>
@@ -1642,7 +1624,7 @@
           <w14:ligatures w14:val="standardContextual"/>
         </w:rPr>
         <w:drawing>
-          <wp:inline distT="0" distB="0" distL="0" distR="0" wp14:anchorId="58FFC05B" wp14:editId="2421B506">
+          <wp:inline distT="0" distB="0" distL="0" distR="0" wp14:anchorId="58FFC05B" wp14:editId="31B208D4">
             <wp:extent cx="5731510" cy="675640"/>
             <wp:effectExtent l="0" t="0" r="0" b="0"/>
             <wp:docPr id="1714823290" name="Рисунок 1"/>
@@ -2050,7 +2032,21 @@
             <w:rStyle w:val="ae"/>
             <w:lang w:val="en-US"/>
           </w:rPr>
-          <w:t>https://github.com/2BuRy1/blps_lab_1/blob/main/server-openapi.yml</w:t>
+          <w:t>https://github.com/2BuRy1/blps_lab_1/blob/main/</w:t>
+        </w:r>
+        <w:r>
+          <w:rPr>
+            <w:rStyle w:val="ae"/>
+            <w:lang w:val="en-US"/>
+          </w:rPr>
+          <w:t>o</w:t>
+        </w:r>
+        <w:r>
+          <w:rPr>
+            <w:rStyle w:val="ae"/>
+            <w:lang w:val="en-US"/>
+          </w:rPr>
+          <w:t>penapi/server-openapi.yml</w:t>
         </w:r>
       </w:hyperlink>
       <w:r>
@@ -2078,7 +2074,7 @@
             <w:rStyle w:val="ae"/>
             <w:lang w:val="en-US"/>
           </w:rPr>
-          <w:t>https://github.com/2BuRy1/blps_lab_1/blob/main/bank-openapi.yml</w:t>
+          <w:t>https://github.com/2BuRy1/blps_lab_1/blob/main/openapi/bank-openapi.yml</w:t>
         </w:r>
       </w:hyperlink>
       <w:r>
@@ -2112,11 +2108,6 @@
       </w:r>
     </w:p>
     <w:p>
-      <w:pPr>
-        <w:rPr>
-          <w:lang w:val="en-US"/>
-        </w:rPr>
-      </w:pPr>
       <w:hyperlink r:id="rId14" w:history="1">
         <w:r>
           <w:rPr>
@@ -2171,13 +2162,7 @@
         <w:t xml:space="preserve"> тестирование функциональности.</w:t>
       </w:r>
     </w:p>
-    <w:p>
-      <w:pPr>
-        <w:rPr>
-          <w:lang w:val="en-US"/>
-        </w:rPr>
-      </w:pPr>
-    </w:p>
+    <w:p/>
     <w:p>
       <w:r>
         <w:t xml:space="preserve"> </w:t>
@@ -2933,6 +2918,7 @@
   <w:style w:type="character" w:default="1" w:styleId="a0">
     <w:name w:val="Default Paragraph Font"/>
     <w:uiPriority w:val="1"/>
+    <w:semiHidden/>
     <w:unhideWhenUsed/>
   </w:style>
   <w:style w:type="table" w:default="1" w:styleId="a1">
@@ -3491,6 +3477,18 @@
     <w:rPr>
       <w:color w:val="605E5C"/>
       <w:shd w:val="clear" w:color="auto" w:fill="E1DFDD"/>
+    </w:rPr>
+  </w:style>
+  <w:style w:type="character" w:styleId="af0">
+    <w:name w:val="FollowedHyperlink"/>
+    <w:basedOn w:val="a0"/>
+    <w:uiPriority w:val="99"/>
+    <w:semiHidden/>
+    <w:unhideWhenUsed/>
+    <w:rsid w:val="00A71714"/>
+    <w:rPr>
+      <w:color w:val="96607D" w:themeColor="followedHyperlink"/>
+      <w:u w:val="single"/>
     </w:rPr>
   </w:style>
 </w:styles>

</xml_diff>